<commit_message>
Balance portfolio sampling overlap
</commit_message>
<xml_diff>
--- a/presentation_materials/HMM_WGAN_Full_Pipeline_Methodology.docx
+++ b/presentation_materials/HMM_WGAN_Full_Pipeline_Methodology.docx
@@ -3666,7 +3666,7 @@
           <w:color w:val="1F2937"/>
           <w:sz w:val="20"/>
         </w:rPr>
-        <w:t>The default experiment draws 10 independent equal-weight portfolios of 50 eligible stocks. A stock cannot repeat within one portfolio but may appear in another. The exact manifests are saved, making the experiment reproducible.</w:t>
+        <w:t>The default experiment jointly constructs 10 equal-weight portfolios of 50 eligible stocks using a balanced low-overlap design. In the current 183-stock universe, every stock appears two or three times and each portfolio pair shares only 10 or 11 stocks. The exact manifests, overlap matrix, and inclusion frequencies are saved for reproducibility.</w:t>
       </w:r>
     </w:p>
     <w:tbl>
@@ -3792,7 +3792,7 @@
                 <w:color w:val="5B6573"/>
                 <w:sz w:val="18"/>
               </w:rPr>
-              <w:t>Bootstrap resampling across portfolios quantifies uncertainty in the average performance difference.</w:t>
+              <w:t>Bootstrap summarizes variation across broad portfolio compositions; overlap diagnostics make residual dependence transparent.</w:t>
             </w:r>
           </w:p>
         </w:tc>
@@ -4436,7 +4436,7 @@
                 <w:color w:val="1F2937"/>
                 <w:sz w:val="20"/>
               </w:rPr>
-              <w:t>We judge dynamic transitions by whether they improve out-of-sample VaR and ES forecasts across multiple randomly drawn portfolios without weakening statistical backtests.</w:t>
+              <w:t>We judge dynamic transitions by whether they improve out-of-sample VaR and ES forecasts across multiple balanced low-overlap portfolios without weakening statistical backtests.</w:t>
             </w:r>
           </w:p>
         </w:tc>

</xml_diff>